<commit_message>
added a placeholder in oath undertaking years of residency
</commit_message>
<xml_diff>
--- a/public/files/Oath-of-Undertaking-for-First-Time-Jobseeker.docx
+++ b/public/files/Oath-of-Undertaking-for-First-Time-Jobseeker.docx
@@ -87,17 +87,51 @@
           <w:szCs w:val="24"/>
           <w:lang w:val="en-US"/>
         </w:rPr>
-        <w:t>{fullname}</w:t>
-      </w:r>
-      <w:r>
-        <w:rPr>
-          <w:b/>
-          <w:bCs/>
-          <w:sz w:val="24"/>
-          <w:szCs w:val="24"/>
-          <w:lang w:val="en-US"/>
-        </w:rPr>
-        <w:t xml:space="preserve"> ,  </w:t>
+        <w:t>{</w:t>
+      </w:r>
+      <w:proofErr w:type="spellStart"/>
+      <w:r>
+        <w:rPr>
+          <w:b/>
+          <w:bCs/>
+          <w:sz w:val="24"/>
+          <w:szCs w:val="24"/>
+          <w:lang w:val="en-US"/>
+        </w:rPr>
+        <w:t>fullname</w:t>
+      </w:r>
+      <w:proofErr w:type="spellEnd"/>
+      <w:proofErr w:type="gramStart"/>
+      <w:r>
+        <w:rPr>
+          <w:b/>
+          <w:bCs/>
+          <w:sz w:val="24"/>
+          <w:szCs w:val="24"/>
+          <w:lang w:val="en-US"/>
+        </w:rPr>
+        <w:t>}</w:t>
+      </w:r>
+      <w:r>
+        <w:rPr>
+          <w:b/>
+          <w:bCs/>
+          <w:sz w:val="24"/>
+          <w:szCs w:val="24"/>
+          <w:lang w:val="en-US"/>
+        </w:rPr>
+        <w:t xml:space="preserve"> ,</w:t>
+      </w:r>
+      <w:proofErr w:type="gramEnd"/>
+      <w:r>
+        <w:rPr>
+          <w:b/>
+          <w:bCs/>
+          <w:sz w:val="24"/>
+          <w:szCs w:val="24"/>
+          <w:lang w:val="en-US"/>
+        </w:rPr>
+        <w:t xml:space="preserve">  </w:t>
       </w:r>
       <w:r>
         <w:rPr>
@@ -151,7 +185,62 @@
           <w:szCs w:val="24"/>
           <w:lang w:val="en-US"/>
         </w:rPr>
-        <w:t xml:space="preserve"> Brgy. Guin-on, Calbayog City, Samar for 5 years, availing the benefits of </w:t>
+        <w:t xml:space="preserve"> </w:t>
+      </w:r>
+      <w:proofErr w:type="spellStart"/>
+      <w:r>
+        <w:rPr>
+          <w:sz w:val="24"/>
+          <w:szCs w:val="24"/>
+          <w:lang w:val="en-US"/>
+        </w:rPr>
+        <w:t>Brgy</w:t>
+      </w:r>
+      <w:proofErr w:type="spellEnd"/>
+      <w:r>
+        <w:rPr>
+          <w:sz w:val="24"/>
+          <w:szCs w:val="24"/>
+          <w:lang w:val="en-US"/>
+        </w:rPr>
+        <w:t xml:space="preserve">. Guin-on, Calbayog City, Samar for </w:t>
+      </w:r>
+      <w:r>
+        <w:rPr>
+          <w:b/>
+          <w:bCs/>
+          <w:sz w:val="24"/>
+          <w:szCs w:val="24"/>
+        </w:rPr>
+        <w:t>{</w:t>
+      </w:r>
+      <w:proofErr w:type="spellStart"/>
+      <w:r>
+        <w:rPr>
+          <w:b/>
+          <w:bCs/>
+          <w:sz w:val="24"/>
+          <w:szCs w:val="24"/>
+        </w:rPr>
+        <w:t>years_lived</w:t>
+      </w:r>
+      <w:proofErr w:type="spellEnd"/>
+      <w:r>
+        <w:rPr>
+          <w:b/>
+          <w:bCs/>
+          <w:sz w:val="24"/>
+          <w:szCs w:val="24"/>
+        </w:rPr>
+        <w:t>}</w:t>
+      </w:r>
+      <w:r>
+        <w:rPr>
+          <w:sz w:val="24"/>
+          <w:szCs w:val="24"/>
+          <w:lang w:val="en-US"/>
+        </w:rPr>
+        <w:t xml:space="preserve"> years, availing the benefits of </w:t>
       </w:r>
       <w:r>
         <w:rPr>
@@ -219,7 +308,25 @@
           <w:szCs w:val="24"/>
           <w:lang w:val="en-US"/>
         </w:rPr>
-        <w:t>That this is the first time that I will actively look for a job and therefore requesting that a Barangay Certification be issued in my favor to avail the benefits of the law;</w:t>
+        <w:t xml:space="preserve">That this is the first time that I will actively look for a job and therefore </w:t>
+      </w:r>
+      <w:proofErr w:type="gramStart"/>
+      <w:r>
+        <w:rPr>
+          <w:sz w:val="24"/>
+          <w:szCs w:val="24"/>
+          <w:lang w:val="en-US"/>
+        </w:rPr>
+        <w:t>requesting</w:t>
+      </w:r>
+      <w:proofErr w:type="gramEnd"/>
+      <w:r>
+        <w:rPr>
+          <w:sz w:val="24"/>
+          <w:szCs w:val="24"/>
+          <w:lang w:val="en-US"/>
+        </w:rPr>
+        <w:t xml:space="preserve"> that a Barangay Certification be issued in my favor to avail the benefits of the law;</w:t>
       </w:r>
     </w:p>
     <w:p>
@@ -242,7 +349,25 @@
           <w:szCs w:val="24"/>
           <w:lang w:val="en-US"/>
         </w:rPr>
-        <w:t>That I am aware that the benefit and privilege/s under the said law shall be valid only for one (1) year from the date that the Barangay Certification is issued;</w:t>
+        <w:t xml:space="preserve">That I am aware that the benefit and </w:t>
+      </w:r>
+      <w:proofErr w:type="gramStart"/>
+      <w:r>
+        <w:rPr>
+          <w:sz w:val="24"/>
+          <w:szCs w:val="24"/>
+          <w:lang w:val="en-US"/>
+        </w:rPr>
+        <w:t>privilege/s</w:t>
+      </w:r>
+      <w:proofErr w:type="gramEnd"/>
+      <w:r>
+        <w:rPr>
+          <w:sz w:val="24"/>
+          <w:szCs w:val="24"/>
+          <w:lang w:val="en-US"/>
+        </w:rPr>
+        <w:t xml:space="preserve"> under the said law shall be valid only for one (1) year from the date that the Barangay Certification is issued;</w:t>
       </w:r>
     </w:p>
     <w:p>
@@ -334,7 +459,25 @@
           <w:szCs w:val="24"/>
           <w:lang w:val="en-US"/>
         </w:rPr>
-        <w:t>That I am not a beneficiary of the JobStart program under R.A. No. 10869 and other laws that give similar exemption for the documents or transactions exempted under R.A. no. 11261;</w:t>
+        <w:t xml:space="preserve">That I am not a beneficiary of the </w:t>
+      </w:r>
+      <w:proofErr w:type="spellStart"/>
+      <w:r>
+        <w:rPr>
+          <w:sz w:val="24"/>
+          <w:szCs w:val="24"/>
+          <w:lang w:val="en-US"/>
+        </w:rPr>
+        <w:t>JobStart</w:t>
+      </w:r>
+      <w:proofErr w:type="spellEnd"/>
+      <w:r>
+        <w:rPr>
+          <w:sz w:val="24"/>
+          <w:szCs w:val="24"/>
+          <w:lang w:val="en-US"/>
+        </w:rPr>
+        <w:t xml:space="preserve"> program under R.A. No. 10869 and other laws that give similar exemption for the documents or transactions exempted under R.A. no. 11261;</w:t>
       </w:r>
     </w:p>
     <w:p>
@@ -351,13 +494,23 @@
           <w:lang w:val="en-US"/>
         </w:rPr>
       </w:pPr>
-      <w:r>
-        <w:rPr>
-          <w:sz w:val="24"/>
-          <w:szCs w:val="24"/>
-          <w:lang w:val="en-US"/>
-        </w:rPr>
-        <w:t>That if issued the requested certification, I will not use the same in any fraud, neither falsely nor help and /or assist in the fabrication of the said certification;</w:t>
+      <w:proofErr w:type="gramStart"/>
+      <w:r>
+        <w:rPr>
+          <w:sz w:val="24"/>
+          <w:szCs w:val="24"/>
+          <w:lang w:val="en-US"/>
+        </w:rPr>
+        <w:t>That if</w:t>
+      </w:r>
+      <w:proofErr w:type="gramEnd"/>
+      <w:r>
+        <w:rPr>
+          <w:sz w:val="24"/>
+          <w:szCs w:val="24"/>
+          <w:lang w:val="en-US"/>
+        </w:rPr>
+        <w:t xml:space="preserve"> issued the requested certification, I will not use the same in any fraud, neither falsely nor help and /or assist in the fabrication of the said certification;</w:t>
       </w:r>
     </w:p>
     <w:p>
@@ -500,15 +653,60 @@
           <w:szCs w:val="24"/>
           <w:lang w:val="en-US"/>
         </w:rPr>
-        <w:t>{this_day}</w:t>
-      </w:r>
-      <w:r>
-        <w:rPr>
-          <w:sz w:val="24"/>
-          <w:szCs w:val="24"/>
-          <w:lang w:val="en-US"/>
-        </w:rPr>
-        <w:t xml:space="preserve">  day of  </w:t>
+        <w:t>{</w:t>
+      </w:r>
+      <w:proofErr w:type="spellStart"/>
+      <w:r>
+        <w:rPr>
+          <w:sz w:val="24"/>
+          <w:szCs w:val="24"/>
+          <w:lang w:val="en-US"/>
+        </w:rPr>
+        <w:t>this_</w:t>
+      </w:r>
+      <w:proofErr w:type="gramStart"/>
+      <w:r>
+        <w:rPr>
+          <w:sz w:val="24"/>
+          <w:szCs w:val="24"/>
+          <w:lang w:val="en-US"/>
+        </w:rPr>
+        <w:t>day</w:t>
+      </w:r>
+      <w:proofErr w:type="spellEnd"/>
+      <w:r>
+        <w:rPr>
+          <w:sz w:val="24"/>
+          <w:szCs w:val="24"/>
+          <w:lang w:val="en-US"/>
+        </w:rPr>
+        <w:t>}</w:t>
+      </w:r>
+      <w:r>
+        <w:rPr>
+          <w:sz w:val="24"/>
+          <w:szCs w:val="24"/>
+          <w:lang w:val="en-US"/>
+        </w:rPr>
+        <w:t xml:space="preserve">  day</w:t>
+      </w:r>
+      <w:proofErr w:type="gramEnd"/>
+      <w:r>
+        <w:rPr>
+          <w:sz w:val="24"/>
+          <w:szCs w:val="24"/>
+          <w:lang w:val="en-US"/>
+        </w:rPr>
+        <w:t xml:space="preserve"> </w:t>
+      </w:r>
+      <w:proofErr w:type="gramStart"/>
+      <w:r>
+        <w:rPr>
+          <w:sz w:val="24"/>
+          <w:szCs w:val="24"/>
+          <w:lang w:val="en-US"/>
+        </w:rPr>
+        <w:t xml:space="preserve">of  </w:t>
       </w:r>
       <w:r>
         <w:rPr>
@@ -532,7 +730,16 @@
           <w:szCs w:val="24"/>
           <w:lang w:val="en-US"/>
         </w:rPr>
-        <w:t>{year}</w:t>
+        <w:t>{</w:t>
+      </w:r>
+      <w:proofErr w:type="gramEnd"/>
+      <w:r>
+        <w:rPr>
+          <w:sz w:val="24"/>
+          <w:szCs w:val="24"/>
+          <w:lang w:val="en-US"/>
+        </w:rPr>
+        <w:t>year}</w:t>
       </w:r>
       <w:r>
         <w:rPr>
@@ -866,8 +1073,18 @@
           <w:szCs w:val="24"/>
           <w:lang w:val="en-US"/>
         </w:rPr>
-        <w:t xml:space="preserve">                                                         BARANGAY  KAGAWAD</w:t>
-      </w:r>
+        <w:t xml:space="preserve">                                                         </w:t>
+      </w:r>
+      <w:proofErr w:type="gramStart"/>
+      <w:r>
+        <w:rPr>
+          <w:sz w:val="24"/>
+          <w:szCs w:val="24"/>
+          <w:lang w:val="en-US"/>
+        </w:rPr>
+        <w:t>BARANGAY  KAGAWAD</w:t>
+      </w:r>
+      <w:proofErr w:type="gramEnd"/>
     </w:p>
     <w:p>
       <w:pPr>
@@ -1506,7 +1723,6 @@
   <w:style w:type="character" w:default="1" w:styleId="DefaultParagraphFont">
     <w:name w:val="Default Paragraph Font"/>
     <w:uiPriority w:val="1"/>
-    <w:semiHidden/>
     <w:unhideWhenUsed/>
   </w:style>
   <w:style w:type="table" w:default="1" w:styleId="TableNormal">

</xml_diff>

<commit_message>
added Barangay Kagawad signature, added Barangay kagawad approval in Oath document and fix visibility for Digital signature in settings
</commit_message>
<xml_diff>
--- a/public/files/Oath-of-Undertaking-for-First-Time-Jobseeker.docx
+++ b/public/files/Oath-of-Undertaking-for-First-Time-Jobseeker.docx
@@ -577,7 +577,7 @@
           <w14:ligatures w14:val="none"/>
         </w:rPr>
         <w:drawing>
-          <wp:anchor distT="0" distB="0" distL="114300" distR="114300" simplePos="0" relativeHeight="251660288" behindDoc="0" locked="0" layoutInCell="1" allowOverlap="1" wp14:anchorId="0A0725AD" wp14:editId="110056A9">
+          <wp:anchor distT="0" distB="0" distL="114300" distR="114300" simplePos="0" relativeHeight="251660288" behindDoc="0" locked="0" layoutInCell="1" allowOverlap="1" wp14:anchorId="0A0725AD" wp14:editId="3E65B022">
             <wp:simplePos x="0" y="0"/>
             <wp:positionH relativeFrom="column">
               <wp:posOffset>3741420</wp:posOffset>
@@ -947,6 +947,39 @@
           <w:lang w:val="en-US"/>
         </w:rPr>
       </w:pPr>
+      <w:r>
+        <w:rPr>
+          <w:sz w:val="24"/>
+          <w:szCs w:val="24"/>
+          <w:lang w:val="en-US"/>
+        </w:rPr>
+        <w:tab/>
+      </w:r>
+      <w:r>
+        <w:rPr>
+          <w:sz w:val="24"/>
+          <w:szCs w:val="24"/>
+          <w:lang w:val="en-US"/>
+        </w:rPr>
+        <w:tab/>
+      </w:r>
+      <w:r>
+        <w:rPr>
+          <w:sz w:val="24"/>
+          <w:szCs w:val="24"/>
+          <w:lang w:val="en-US"/>
+        </w:rPr>
+        <w:tab/>
+        <w:t xml:space="preserve">                         </w:t>
+      </w:r>
+      <w:r>
+        <w:rPr>
+          <w:sz w:val="24"/>
+          <w:szCs w:val="24"/>
+          <w:lang w:val="en-US"/>
+        </w:rPr>
+        <w:t>Witnessed by:</w:t>
+      </w:r>
     </w:p>
     <w:p>
       <w:pPr>
@@ -959,45 +992,85 @@
       </w:pPr>
       <w:r>
         <w:rPr>
-          <w:sz w:val="24"/>
-          <w:szCs w:val="24"/>
-          <w:lang w:val="en-US"/>
-        </w:rPr>
-        <w:tab/>
-      </w:r>
-      <w:r>
-        <w:rPr>
-          <w:sz w:val="24"/>
-          <w:szCs w:val="24"/>
-          <w:lang w:val="en-US"/>
-        </w:rPr>
-        <w:tab/>
-      </w:r>
-      <w:r>
-        <w:rPr>
-          <w:sz w:val="24"/>
-          <w:szCs w:val="24"/>
-          <w:lang w:val="en-US"/>
-        </w:rPr>
-        <w:tab/>
-      </w:r>
-      <w:r>
-        <w:rPr>
-          <w:sz w:val="24"/>
-          <w:szCs w:val="24"/>
-          <w:lang w:val="en-US"/>
-        </w:rPr>
-        <w:tab/>
-      </w:r>
-      <w:r>
-        <w:rPr>
-          <w:sz w:val="24"/>
-          <w:szCs w:val="24"/>
-          <w:lang w:val="en-US"/>
-        </w:rPr>
-        <w:tab/>
-        <w:t>Witnessed by:</w:t>
-      </w:r>
+          <w:noProof/>
+          <w:sz w:val="24"/>
+          <w:szCs w:val="24"/>
+          <w:lang w:val="en-US"/>
+          <w14:ligatures w14:val="none"/>
+        </w:rPr>
+        <w:drawing>
+          <wp:anchor distT="0" distB="0" distL="114300" distR="114300" simplePos="0" relativeHeight="251662336" behindDoc="0" locked="0" layoutInCell="1" allowOverlap="1" wp14:anchorId="40A2A89B" wp14:editId="2324E74B">
+            <wp:simplePos x="0" y="0"/>
+            <wp:positionH relativeFrom="column">
+              <wp:posOffset>2034540</wp:posOffset>
+            </wp:positionH>
+            <wp:positionV relativeFrom="page">
+              <wp:posOffset>9105900</wp:posOffset>
+            </wp:positionV>
+            <wp:extent cx="1189990" cy="550370"/>
+            <wp:effectExtent l="0" t="0" r="0" b="2540"/>
+            <wp:wrapNone/>
+            <wp:docPr id="748640702" name="Picture 2" descr="Kagawad Signature"/>
+            <wp:cNvGraphicFramePr>
+              <a:graphicFrameLocks xmlns:a="http://schemas.openxmlformats.org/drawingml/2006/main" noChangeAspect="1"/>
+            </wp:cNvGraphicFramePr>
+            <a:graphic xmlns:a="http://schemas.openxmlformats.org/drawingml/2006/main">
+              <a:graphicData uri="http://schemas.openxmlformats.org/drawingml/2006/picture">
+                <pic:pic xmlns:pic="http://schemas.openxmlformats.org/drawingml/2006/picture">
+                  <pic:nvPicPr>
+                    <pic:cNvPr id="748640702" name="Picture 2" descr="Kagawad Signature"/>
+                    <pic:cNvPicPr>
+                      <a:picLocks noChangeAspect="1" noChangeArrowheads="1"/>
+                    </pic:cNvPicPr>
+                  </pic:nvPicPr>
+                  <pic:blipFill>
+                    <a:blip r:embed="rId7" cstate="print">
+                      <a:extLst>
+                        <a:ext uri="{28A0092B-C50C-407E-A947-70E740481C1C}">
+                          <a14:useLocalDpi xmlns:a14="http://schemas.microsoft.com/office/drawing/2010/main" val="0"/>
+                        </a:ext>
+                      </a:extLst>
+                    </a:blip>
+                    <a:srcRect/>
+                    <a:stretch>
+                      <a:fillRect/>
+                    </a:stretch>
+                  </pic:blipFill>
+                  <pic:spPr bwMode="auto">
+                    <a:xfrm>
+                      <a:off x="0" y="0"/>
+                      <a:ext cx="1189990" cy="550370"/>
+                    </a:xfrm>
+                    <a:prstGeom prst="rect">
+                      <a:avLst/>
+                    </a:prstGeom>
+                    <a:noFill/>
+                    <a:ln>
+                      <a:noFill/>
+                    </a:ln>
+                  </pic:spPr>
+                </pic:pic>
+              </a:graphicData>
+            </a:graphic>
+            <wp14:sizeRelH relativeFrom="page">
+              <wp14:pctWidth>0</wp14:pctWidth>
+            </wp14:sizeRelH>
+            <wp14:sizeRelV relativeFrom="page">
+              <wp14:pctHeight>0</wp14:pctHeight>
+            </wp14:sizeRelV>
+          </wp:anchor>
+        </w:drawing>
+      </w:r>
+    </w:p>
+    <w:p>
+      <w:pPr>
+        <w:spacing w:after="0"/>
+        <w:rPr>
+          <w:sz w:val="24"/>
+          <w:szCs w:val="24"/>
+          <w:lang w:val="en-US"/>
+        </w:rPr>
+      </w:pPr>
     </w:p>
     <w:p>
       <w:pPr>
@@ -1723,6 +1796,7 @@
   <w:style w:type="character" w:default="1" w:styleId="DefaultParagraphFont">
     <w:name w:val="Default Paragraph Font"/>
     <w:uiPriority w:val="1"/>
+    <w:semiHidden/>
     <w:unhideWhenUsed/>
   </w:style>
   <w:style w:type="table" w:default="1" w:styleId="TableNormal">

</xml_diff>